<commit_message>
Création d'un programme afin de crypter le fichier clé en ASCII pour le partager. Nouvelle fonction, nouvelle interface graphique
</commit_message>
<xml_diff>
--- a/Fiche_suivie.docx
+++ b/Fiche_suivie.docx
@@ -124,7 +124,13 @@
         <w:t>différentes</w:t>
       </w:r>
       <w:r>
-        <w:t xml:space="preserve"> taches.</w:t>
+        <w:t xml:space="preserve"> </w:t>
+      </w:r>
+      <w:r>
+        <w:t>tâches</w:t>
+      </w:r>
+      <w:r>
+        <w:t>.</w:t>
       </w:r>
     </w:p>
     <w:p/>
@@ -198,7 +204,10 @@
         <w:t xml:space="preserve">eme </w:t>
       </w:r>
       <w:r>
-        <w:t xml:space="preserve"> RDV TIPE avec Mr TORREQUADRA </w:t>
+        <w:t>RDV</w:t>
+      </w:r>
+      <w:r>
+        <w:t xml:space="preserve"> TIPE avec Mr TORREQUADRA </w:t>
       </w:r>
       <w:r>
         <w:rPr>
@@ -239,7 +248,13 @@
         <w:t>création</w:t>
       </w:r>
       <w:r>
-        <w:t xml:space="preserve"> du document final + accord sur les choses a faire </w:t>
+        <w:t xml:space="preserve"> du document final + accord sur les choses </w:t>
+      </w:r>
+      <w:r>
+        <w:t>à</w:t>
+      </w:r>
+      <w:r>
+        <w:t xml:space="preserve"> faire </w:t>
       </w:r>
     </w:p>
     <w:p/>

</xml_diff>